<commit_message>
docs: bản đồ 46 bảng (du_an_tai_lieu, du_an_can, van_kich); SRD .docx sinh lại
Co-Authored-By: Claude Fable 5.1 <noreply@anthropic.com>
Claude-Session: https://claude.ai/code/session_01Kb2QXjSsUHd7FGLHriHFMw
</commit_message>
<xml_diff>
--- a/docs/SRD-AI-Oi-Nha-Dat.docx
+++ b/docs/SRD-AI-Oi-Nha-Dat.docx
@@ -2499,7 +2499,7 @@
           <w:sz w:val="22"/>
           <w:szCs w:val="22"/>
         </w:rPr>
-        <w:t xml:space="preserve">43 bảng, 19 view public, năm nhóm [RỔ HÀNG] [NGƯỜI &amp; HỘI THOẠI] [BOT &amp; HÀNG ĐỢI] [CTV] [HỆ THỐNG]; chú thích bảng nằm TRONG DB (comment on). Ba hàng đợi bằng bảng (inbound_ledger, reminders, media_cleanup_queue) với hợp đồng thuê và thư chết — tin không mất khi một bên offline (NFR-04). Schema `so` cho người đọc như Excel (so.ro_hang, so.nguoi_ban, so.hoi_thoai). Dữ liệu thử và thật tách bằng la_id_thu().</w:t>
+        <w:t xml:space="preserve">46 bảng (soát 06/10/2026), năm nhóm [RỔ HÀNG] [NGƯỜI &amp; HỘI THOẠI] [BOT &amp; HÀNG ĐỢI] [CTV] [HỆ THỐNG] cùng các view đọc cho người và admin; chú thích bảng nằm TRONG DB (comment on). Ba hàng đợi bằng bảng (inbound_ledger, reminders, media_cleanup_queue) với hợp đồng thuê và thư chết — tin không mất khi một bên offline (NFR-04). Schema `so` cho người đọc như Excel (so.ro_hang, so.nguoi_ban, so.hoi_thoai). Dữ liệu thử và thật tách bằng la_id_thu().</w:t>
       </w:r>
     </w:p>
     <w:p>
@@ -2611,7 +2611,7 @@
           <w:sz w:val="22"/>
           <w:szCs w:val="22"/>
         </w:rPr>
-        <w:t xml:space="preserve">Sổ lỗi bot_errors (SĐT luôn che), bot_health_tick mỗi giờ quét kết quả thật của net._http_response (không tin trạng thái cron), còi ntfy đọc lại bằng chứng gửi tới; trần lượt / ngày và chuông hết tiền.</w:t>
+        <w:t xml:space="preserve">Sổ lỗi bot_errors (SĐT luôn che), bot_health_tick mỗi giờ quét kết quả thật của net._http_response (không tin trạng thái cron), còi ntfy đọc lại bằng chứng gửi tới; trần lượt / ngày và chuông hết tiền. Sổ van_kich ghi mỗi lần một van hậu kiểm đổi lời model (van nào, trước, sau) — đo trước khi quyết bỏ van; công tắc luat_loi_bot: gọn (mặc định) tắt toàn bộ van sửa văn, chỉ còn lưới an toàn và ghi đúng ô (06/10/2026).</w:t>
       </w:r>
     </w:p>
     <w:p>

</xml_diff>

<commit_message>
Sinh lại SRD .docx theo SRS-5.1zzx
Co-Authored-By: Claude Opus 5.5 <noreply@anthropic.com>
Claude-Session: https://claude.ai/code/session_01Kb2QXjSsUHd7FGLHriHFMw
</commit_message>
<xml_diff>
--- a/docs/SRD-AI-Oi-Nha-Dat.docx
+++ b/docs/SRD-AI-Oi-Nha-Dat.docx
@@ -1719,7 +1719,7 @@
           <w:sz w:val="22"/>
           <w:szCs w:val="22"/>
         </w:rPr>
-        <w:t xml:space="preserve">= (50 % trung bình điểm các tin đang rao + 50 % điểm phản hồi kịp thời) × hệ số thưởng quy mô. Điểm phản hồi đo theo messages 90 ngày: bot nhắn → chủ trả lời sau ≤ 1 giờ 100 · ≤ 12 giờ 80 · ≤ 24 giờ 60 · ≤ 3 ngày 30 · không trả lời 0. Chưa đo được phản hồi thì tính 100 % hoàn chỉnh (FR-183, SRS-5.1zzd).</w:t>
+        <w:t xml:space="preserve">= (50 % trung bình điểm các tin đang rao + 50 % điểm phản hồi kịp thời) × hệ số thưởng quy mô. Điểm phản hồi đo theo messages 90 ngày: bot nhắn → chủ trả lời sau ≤ 1 giờ 100 · ≤ 12 giờ 80 · ≤ 24 giờ 60 · ≤ 3 ngày 30 · không trả lời 0. Chỉ đo lượt bot CHỦ ĐỘNG nhắn khi chủ nhà đã im &gt; 30 phút (hỏi bù, "còn bán không", giữ kết nối); dưới 5 lượt như vậy thì chưa tính, điểm người rao = 100 % hoàn chỉnh (FR-183, SRS-5.1zzd, SRS-5.1zzx).</w:t>
       </w:r>
     </w:p>
     <w:p>
@@ -1975,7 +1975,7 @@
           <w:sz w:val="22"/>
           <w:szCs w:val="22"/>
         </w:rPr>
-        <w:t xml:space="preserve">NMG Vàng: tin được xếp lên đầu kho khi khách mua đã đủ khu vực + ngân sách. CCRB Vàng: tin vừa lên kệ được đẩy tới ≤ 20 NMG lõi có Zalo (ưu tiên Vàng → đang hoạt động → điểm), mỗi NMG ≤ 1 tin / ngày.</w:t>
+        <w:t xml:space="preserve">Mọi người bán Vàng (chính chủ lẫn môi giới): tin được xếp lên đầu kho khi khách mua nhắn bot đã nói đủ khu vực + ngân sách (chỉ trong chat, không phải thứ tự trên web). CCRB Vàng: tin vừa lên kệ được đẩy tới ≤ 20 NMG lõi có Zalo (ưu tiên Vàng → đang hoạt động → điểm), mỗi NMG ≤ 1 tin / ngày.</w:t>
       </w:r>
     </w:p>
     <w:p>
@@ -2555,7 +2555,7 @@
           <w:sz w:val="22"/>
           <w:szCs w:val="22"/>
         </w:rPr>
-        <w:t xml:space="preserve">Web (SEO, trang tin, widget Zalo mang ngữ cảnh) → Zalo → khai thác khu vực + tầm giá → gợi ≤ 3 căn từ KHO (ưu tiên gấp → nghĩa → mới; NMG Vàng lên đầu) → khách hỏi căn → bot khai mọi thứ đã lưu, chưa có thì hỏi chủ nhà / CTV → đặt lịch xem (CTV dẫn) → chấm sao → vòng đời tin (sold báo người đang chờ). Trợ lý có công cụ (app_config.tro_ly): tìm tiện ích quanh khu vực, xem căn; công cụ ghi phải có trích dẫn.</w:t>
+        <w:t xml:space="preserve">Web (SEO, trang tin, widget Zalo mang ngữ cảnh) → Zalo → khai thác khu vực + tầm giá → gợi ≤ 3 căn từ KHO (ưu tiên gấp → nghĩa → mới; người bán Vàng lên đầu) → khách hỏi căn → bot khai mọi thứ đã lưu, chưa có thì hỏi chủ nhà / CTV → đặt lịch xem (CTV dẫn) → chấm sao → vòng đời tin (sold báo người đang chờ). Trợ lý có công cụ (app_config.tro_ly): tìm tiện ích quanh khu vực, xem căn; công cụ ghi phải có trích dẫn.</w:t>
       </w:r>
     </w:p>
     <w:p>

</xml_diff>